<commit_message>
Word field tables and locales, ERF/NORMSINV precision, in-cell floats and header reservation, Office menus and editable combos
- Fields: cell references in table formulas, date/locale data, props and tables at 100% against Word
- Calc: bit-exact ERF family, NORM.S.INV work, 5832 known differences recorded
- Layout: frames, in-cell floating objects, header/footer reservation, anchor probes
- UI: shell menus with sub-menus and scrolling, editable font/size/numFmt combos, scroll buttons, Sheets popups moved onto the shell menus
</commit_message>
<xml_diff>
--- a/fixtures/docx/fields-props.docx
+++ b/fixtures/docx/fields-props.docx
@@ -1074,7 +1074,7 @@
     <w:link w:val="Heading1Char"/>
     <w:uiPriority w:val="9"/>
     <w:qFormat/>
-    <w:rsid w:val="00F40455"/>
+    <w:rsid w:val="0061025C"/>
     <w:pPr>
       <w:keepNext/>
       <w:keepLines/>
@@ -1097,7 +1097,7 @@
     <w:semiHidden/>
     <w:unhideWhenUsed/>
     <w:qFormat/>
-    <w:rsid w:val="00F40455"/>
+    <w:rsid w:val="0061025C"/>
     <w:pPr>
       <w:keepNext/>
       <w:keepLines/>
@@ -1120,7 +1120,7 @@
     <w:semiHidden/>
     <w:unhideWhenUsed/>
     <w:qFormat/>
-    <w:rsid w:val="00F40455"/>
+    <w:rsid w:val="0061025C"/>
     <w:pPr>
       <w:keepNext/>
       <w:keepLines/>
@@ -1143,7 +1143,7 @@
     <w:semiHidden/>
     <w:unhideWhenUsed/>
     <w:qFormat/>
-    <w:rsid w:val="00F40455"/>
+    <w:rsid w:val="0061025C"/>
     <w:pPr>
       <w:keepNext/>
       <w:keepLines/>
@@ -1166,7 +1166,7 @@
     <w:semiHidden/>
     <w:unhideWhenUsed/>
     <w:qFormat/>
-    <w:rsid w:val="00F40455"/>
+    <w:rsid w:val="0061025C"/>
     <w:pPr>
       <w:keepNext/>
       <w:keepLines/>
@@ -1187,7 +1187,7 @@
     <w:semiHidden/>
     <w:unhideWhenUsed/>
     <w:qFormat/>
-    <w:rsid w:val="00F40455"/>
+    <w:rsid w:val="0061025C"/>
     <w:pPr>
       <w:keepNext/>
       <w:keepLines/>
@@ -1210,7 +1210,7 @@
     <w:semiHidden/>
     <w:unhideWhenUsed/>
     <w:qFormat/>
-    <w:rsid w:val="00F40455"/>
+    <w:rsid w:val="0061025C"/>
     <w:pPr>
       <w:keepNext/>
       <w:keepLines/>
@@ -1231,7 +1231,7 @@
     <w:semiHidden/>
     <w:unhideWhenUsed/>
     <w:qFormat/>
-    <w:rsid w:val="00F40455"/>
+    <w:rsid w:val="0061025C"/>
     <w:pPr>
       <w:keepNext/>
       <w:keepLines/>
@@ -1254,7 +1254,7 @@
     <w:semiHidden/>
     <w:unhideWhenUsed/>
     <w:qFormat/>
-    <w:rsid w:val="00F40455"/>
+    <w:rsid w:val="0061025C"/>
     <w:pPr>
       <w:keepNext/>
       <w:keepLines/>
@@ -1298,7 +1298,7 @@
     <w:basedOn w:val="DefaultParagraphFont"/>
     <w:link w:val="Heading1"/>
     <w:uiPriority w:val="9"/>
-    <w:rsid w:val="00F40455"/>
+    <w:rsid w:val="0061025C"/>
     <w:rPr>
       <w:rFonts w:asciiTheme="majorHAnsi" w:eastAsiaTheme="majorEastAsia" w:hAnsiTheme="majorHAnsi" w:cstheme="majorBidi"/>
       <w:color w:val="2F5496" w:themeColor="accent1" w:themeShade="BF"/>
@@ -1312,7 +1312,7 @@
     <w:link w:val="Heading2"/>
     <w:uiPriority w:val="9"/>
     <w:semiHidden/>
-    <w:rsid w:val="00F40455"/>
+    <w:rsid w:val="0061025C"/>
     <w:rPr>
       <w:rFonts w:asciiTheme="majorHAnsi" w:eastAsiaTheme="majorEastAsia" w:hAnsiTheme="majorHAnsi" w:cstheme="majorBidi"/>
       <w:color w:val="2F5496" w:themeColor="accent1" w:themeShade="BF"/>
@@ -1326,7 +1326,7 @@
     <w:link w:val="Heading3"/>
     <w:uiPriority w:val="9"/>
     <w:semiHidden/>
-    <w:rsid w:val="00F40455"/>
+    <w:rsid w:val="0061025C"/>
     <w:rPr>
       <w:rFonts w:eastAsiaTheme="majorEastAsia" w:cstheme="majorBidi"/>
       <w:color w:val="2F5496" w:themeColor="accent1" w:themeShade="BF"/>
@@ -1340,7 +1340,7 @@
     <w:link w:val="Heading4"/>
     <w:uiPriority w:val="9"/>
     <w:semiHidden/>
-    <w:rsid w:val="00F40455"/>
+    <w:rsid w:val="0061025C"/>
     <w:rPr>
       <w:rFonts w:eastAsiaTheme="majorEastAsia" w:cstheme="majorBidi"/>
       <w:i/>
@@ -1354,7 +1354,7 @@
     <w:link w:val="Heading5"/>
     <w:uiPriority w:val="9"/>
     <w:semiHidden/>
-    <w:rsid w:val="00F40455"/>
+    <w:rsid w:val="0061025C"/>
     <w:rPr>
       <w:rFonts w:eastAsiaTheme="majorEastAsia" w:cstheme="majorBidi"/>
       <w:color w:val="2F5496" w:themeColor="accent1" w:themeShade="BF"/>
@@ -1366,7 +1366,7 @@
     <w:link w:val="Heading6"/>
     <w:uiPriority w:val="9"/>
     <w:semiHidden/>
-    <w:rsid w:val="00F40455"/>
+    <w:rsid w:val="0061025C"/>
     <w:rPr>
       <w:rFonts w:eastAsiaTheme="majorEastAsia" w:cstheme="majorBidi"/>
       <w:i/>
@@ -1380,7 +1380,7 @@
     <w:link w:val="Heading7"/>
     <w:uiPriority w:val="9"/>
     <w:semiHidden/>
-    <w:rsid w:val="00F40455"/>
+    <w:rsid w:val="0061025C"/>
     <w:rPr>
       <w:rFonts w:eastAsiaTheme="majorEastAsia" w:cstheme="majorBidi"/>
       <w:color w:val="595959" w:themeColor="text1" w:themeTint="A6"/>
@@ -1392,7 +1392,7 @@
     <w:link w:val="Heading8"/>
     <w:uiPriority w:val="9"/>
     <w:semiHidden/>
-    <w:rsid w:val="00F40455"/>
+    <w:rsid w:val="0061025C"/>
     <w:rPr>
       <w:rFonts w:eastAsiaTheme="majorEastAsia" w:cstheme="majorBidi"/>
       <w:i/>
@@ -1406,7 +1406,7 @@
     <w:link w:val="Heading9"/>
     <w:uiPriority w:val="9"/>
     <w:semiHidden/>
-    <w:rsid w:val="00F40455"/>
+    <w:rsid w:val="0061025C"/>
     <w:rPr>
       <w:rFonts w:eastAsiaTheme="majorEastAsia" w:cstheme="majorBidi"/>
       <w:color w:val="272727" w:themeColor="text1" w:themeTint="D8"/>
@@ -1419,7 +1419,7 @@
     <w:link w:val="TitleChar"/>
     <w:uiPriority w:val="10"/>
     <w:qFormat/>
-    <w:rsid w:val="00F40455"/>
+    <w:rsid w:val="0061025C"/>
     <w:pPr>
       <w:spacing w:after="80" w:line="240" w:lineRule="auto"/>
       <w:contextualSpacing/>
@@ -1437,7 +1437,7 @@
     <w:basedOn w:val="DefaultParagraphFont"/>
     <w:link w:val="Title"/>
     <w:uiPriority w:val="10"/>
-    <w:rsid w:val="00F40455"/>
+    <w:rsid w:val="0061025C"/>
     <w:rPr>
       <w:rFonts w:asciiTheme="majorHAnsi" w:eastAsiaTheme="majorEastAsia" w:hAnsiTheme="majorHAnsi" w:cstheme="majorBidi"/>
       <w:spacing w:val="-10"/>
@@ -1453,7 +1453,7 @@
     <w:link w:val="SubtitleChar"/>
     <w:uiPriority w:val="11"/>
     <w:qFormat/>
-    <w:rsid w:val="00F40455"/>
+    <w:rsid w:val="0061025C"/>
     <w:pPr>
       <w:numPr>
         <w:ilvl w:val="1"/>
@@ -1472,7 +1472,7 @@
     <w:basedOn w:val="DefaultParagraphFont"/>
     <w:link w:val="Subtitle"/>
     <w:uiPriority w:val="11"/>
-    <w:rsid w:val="00F40455"/>
+    <w:rsid w:val="0061025C"/>
     <w:rPr>
       <w:rFonts w:eastAsiaTheme="majorEastAsia" w:cstheme="majorBidi"/>
       <w:color w:val="595959" w:themeColor="text1" w:themeTint="A6"/>
@@ -1488,7 +1488,7 @@
     <w:link w:val="QuoteChar"/>
     <w:uiPriority w:val="29"/>
     <w:qFormat/>
-    <w:rsid w:val="00F40455"/>
+    <w:rsid w:val="0061025C"/>
     <w:pPr>
       <w:spacing w:before="160"/>
       <w:jc w:val="center"/>
@@ -1504,7 +1504,7 @@
     <w:basedOn w:val="DefaultParagraphFont"/>
     <w:link w:val="Quote"/>
     <w:uiPriority w:val="29"/>
-    <w:rsid w:val="00F40455"/>
+    <w:rsid w:val="0061025C"/>
     <w:rPr>
       <w:i/>
       <w:iCs/>
@@ -1516,7 +1516,7 @@
     <w:basedOn w:val="Normal"/>
     <w:uiPriority w:val="34"/>
     <w:qFormat/>
-    <w:rsid w:val="00F40455"/>
+    <w:rsid w:val="0061025C"/>
     <w:pPr>
       <w:ind w:left="720"/>
       <w:contextualSpacing/>
@@ -1527,7 +1527,7 @@
     <w:basedOn w:val="DefaultParagraphFont"/>
     <w:uiPriority w:val="21"/>
     <w:qFormat/>
-    <w:rsid w:val="00F40455"/>
+    <w:rsid w:val="0061025C"/>
     <w:rPr>
       <w:i/>
       <w:iCs/>
@@ -1541,7 +1541,7 @@
     <w:link w:val="IntenseQuoteChar"/>
     <w:uiPriority w:val="30"/>
     <w:qFormat/>
-    <w:rsid w:val="00F40455"/>
+    <w:rsid w:val="0061025C"/>
     <w:pPr>
       <w:pBdr>
         <w:top w:val="single" w:sz="4" w:space="10" w:color="2F5496" w:themeColor="accent1" w:themeShade="BF"/>
@@ -1562,7 +1562,7 @@
     <w:basedOn w:val="DefaultParagraphFont"/>
     <w:link w:val="IntenseQuote"/>
     <w:uiPriority w:val="30"/>
-    <w:rsid w:val="00F40455"/>
+    <w:rsid w:val="0061025C"/>
     <w:rPr>
       <w:i/>
       <w:iCs/>
@@ -1574,7 +1574,7 @@
     <w:basedOn w:val="DefaultParagraphFont"/>
     <w:uiPriority w:val="32"/>
     <w:qFormat/>
-    <w:rsid w:val="00F40455"/>
+    <w:rsid w:val="0061025C"/>
     <w:rPr>
       <w:b/>
       <w:bCs/>

</xml_diff>